<commit_message>
Generate and update flowcharts as high-resolution images in document
</commit_message>
<xml_diff>
--- a/CineIntelligence_Project_Documentation.docx
+++ b/CineIntelligence_Project_Documentation.docx
@@ -11,7 +11,7 @@
           <w:rFonts w:ascii="Arial" w:hAnsi="Arial"/>
           <w:b/>
           <w:color w:val="2563EB"/>
-          <w:sz w:val="56"/>
+          <w:sz w:val="52"/>
         </w:rPr>
         <w:t>CineIntelligence™</w:t>
         <w:br/>
@@ -23,91 +23,177 @@
       </w:pPr>
       <w:r>
         <w:rPr>
+          <w:rFonts w:ascii="Arial" w:hAnsi="Arial"/>
           <w:i/>
           <w:color w:val="475569"/>
-          <w:sz w:val="28"/>
+          <w:sz w:val="26"/>
         </w:rPr>
         <w:t>Enterprise Pre-Release Film Rating Prediction &amp; Commercial Acquisition Intelligence Platform</w:t>
         <w:br/>
+        <w:t>Detailed Technical, Architectural &amp; Flowchart Specification Report</w:t>
+        <w:br/>
       </w:r>
     </w:p>
+    <w:tbl>
+      <w:tblPr>
+        <w:tblW w:type="auto" w:w="0"/>
+        <w:jc w:val="center"/>
+        <w:tblLook w:firstColumn="1" w:firstRow="1" w:lastColumn="0" w:lastRow="0" w:noHBand="0" w:noVBand="1" w:val="04A0"/>
+      </w:tblPr>
+      <w:tblGrid>
+        <w:gridCol w:w="4680"/>
+        <w:gridCol w:w="4680"/>
+      </w:tblGrid>
+      <w:tr>
+        <w:tc>
+          <w:tcPr>
+            <w:tcW w:type="dxa" w:w="4680"/>
+            <w:shd w:fill="EFF6FF"/>
+          </w:tcPr>
+          <w:p>
+            <w:r>
+              <w:rPr>
+                <w:b/>
+              </w:rPr>
+              <w:t>Project Author / Lead</w:t>
+            </w:r>
+          </w:p>
+        </w:tc>
+        <w:tc>
+          <w:tcPr>
+            <w:tcW w:type="dxa" w:w="4680"/>
+            <w:shd w:fill="F8FAFC"/>
+          </w:tcPr>
+          <w:p>
+            <w:r>
+              <w:t>Harish Rohith (iamharishrohith@gmail.com)</w:t>
+            </w:r>
+          </w:p>
+        </w:tc>
+      </w:tr>
+      <w:tr>
+        <w:tc>
+          <w:tcPr>
+            <w:tcW w:type="dxa" w:w="4680"/>
+            <w:shd w:fill="EFF6FF"/>
+          </w:tcPr>
+          <w:p>
+            <w:r>
+              <w:rPr>
+                <w:b/>
+              </w:rPr>
+              <w:t>Platform Architecture</w:t>
+            </w:r>
+          </w:p>
+        </w:tc>
+        <w:tc>
+          <w:tcPr>
+            <w:tcW w:type="dxa" w:w="4680"/>
+            <w:shd w:fill="F8FAFC"/>
+          </w:tcPr>
+          <w:p>
+            <w:r>
+              <w:t>Flask (REST API + Glassmorphic UI) &amp; Streamlit</w:t>
+            </w:r>
+          </w:p>
+        </w:tc>
+      </w:tr>
+      <w:tr>
+        <w:tc>
+          <w:tcPr>
+            <w:tcW w:type="dxa" w:w="4680"/>
+            <w:shd w:fill="EFF6FF"/>
+          </w:tcPr>
+          <w:p>
+            <w:r>
+              <w:rPr>
+                <w:b/>
+              </w:rPr>
+              <w:t>Machine Learning Engine</w:t>
+            </w:r>
+          </w:p>
+        </w:tc>
+        <w:tc>
+          <w:tcPr>
+            <w:tcW w:type="dxa" w:w="4680"/>
+            <w:shd w:fill="F8FAFC"/>
+          </w:tcPr>
+          <w:p>
+            <w:r>
+              <w:t>Scikit-Learn Gradient Boosting Classifier (0.9980 F1)</w:t>
+            </w:r>
+          </w:p>
+        </w:tc>
+      </w:tr>
+      <w:tr>
+        <w:tc>
+          <w:tcPr>
+            <w:tcW w:type="dxa" w:w="4680"/>
+            <w:shd w:fill="EFF6FF"/>
+          </w:tcPr>
+          <w:p>
+            <w:r>
+              <w:rPr>
+                <w:b/>
+              </w:rPr>
+              <w:t>GitHub Repository</w:t>
+            </w:r>
+          </w:p>
+        </w:tc>
+        <w:tc>
+          <w:tcPr>
+            <w:tcW w:type="dxa" w:w="4680"/>
+            <w:shd w:fill="F8FAFC"/>
+          </w:tcPr>
+          <w:p>
+            <w:r>
+              <w:t>https://github.com/iamharishrohith/CineIntelligence</w:t>
+            </w:r>
+          </w:p>
+        </w:tc>
+      </w:tr>
+    </w:tbl>
     <w:p>
       <w:pPr>
-        <w:spacing w:after="400"/>
+        <w:spacing w:after="360"/>
       </w:pPr>
     </w:p>
     <w:p>
       <w:pPr>
-        <w:spacing w:before="360" w:after="160"/>
+        <w:spacing w:before="400" w:after="160"/>
       </w:pPr>
       <w:r>
         <w:rPr>
           <w:rFonts w:ascii="Arial" w:hAnsi="Arial"/>
           <w:b/>
           <w:color w:val="2563EB"/>
-          <w:sz w:val="36"/>
+          <w:sz w:val="34"/>
         </w:rPr>
-        <w:t>1. Executive Summary &amp; Project Overview</w:t>
+        <w:t>1. Executive Summary &amp; Vision</w:t>
       </w:r>
     </w:p>
     <w:p>
       <w:r>
-        <w:t>CineIntelligence™ is an enterprise AI decision-support platform engineered for film production studios, theatrical distributors, and streaming OTT networks (Netflix, Amazon Prime Video, Disney+ Hotstar). The platform evaluates pre-release movie proposals, predicts expected IMDb rating categories (High ≥ 7.5, Medium 5.5 - 7.4, Low &lt; 5.5), and calculates automated Reputation Indices across 66 feature dimensions.</w:t>
+        <w:t>CineIntelligence™ is a state-of-the-art enterprise AI decision-support platform engineered specifically for theatrical film distributors, OTT streaming networks (Netflix, Amazon Prime Video, Disney+ Hotstar), and independent film production studios. The platform evaluates pre-release movie proposals, predicts expected IMDb rating categories (High ≥ 7.5, Medium 5.5 - 7.4, Low &lt; 5.5), and outputs automated commercial acquisition recommendations, greenlight risk badges, and marketing budget allocations.</w:t>
       </w:r>
     </w:p>
     <w:p>
       <w:pPr>
-        <w:spacing w:before="360" w:after="160"/>
+        <w:spacing w:before="400" w:after="160"/>
       </w:pPr>
       <w:r>
         <w:rPr>
           <w:rFonts w:ascii="Arial" w:hAnsi="Arial"/>
           <w:b/>
           <w:color w:val="2563EB"/>
-          <w:sz w:val="36"/>
+          <w:sz w:val="34"/>
         </w:rPr>
-        <w:t>2. Problem Statement &amp; Industry Context</w:t>
+        <w:t>2. Problem Statement &amp; Financial Risk Analysis</w:t>
       </w:r>
     </w:p>
     <w:p>
       <w:r>
-        <w:t>In the digital entertainment industry, acquisition executives spend hundreds of millions acquiring film distribution rights prior to release. Traditional acquisitions rely heavily on intuition, leading to severe financial risk and underperforming catalog acquisitions.</w:t>
-      </w:r>
-    </w:p>
-    <w:p>
-      <w:r>
-        <w:t>CineIntelligence™ addresses this by delivering a data-driven Machine Learning classification pipeline that categorizes proposals into:</w:t>
-      </w:r>
-    </w:p>
-    <w:p>
-      <w:r>
-        <w:rPr>
-          <w:b/>
-        </w:rPr>
-        <w:t xml:space="preserve">• High Category (IMDb Score ≥ 7.5): </w:t>
-      </w:r>
-      <w:r>
-        <w:t>Premium theatrical &amp; top-tier streaming release candidates.</w:t>
-        <w:br/>
-      </w:r>
-      <w:r>
-        <w:rPr>
-          <w:b/>
-        </w:rPr>
-        <w:t xml:space="preserve">• Medium Category (IMDb Score 5.5 - 7.4): </w:t>
-      </w:r>
-      <w:r>
-        <w:t>Standard catalog release candidates.</w:t>
-        <w:br/>
-      </w:r>
-      <w:r>
-        <w:rPr>
-          <w:b/>
-        </w:rPr>
-        <w:t xml:space="preserve">• Low Category (IMDb Score &lt; 5.5): </w:t>
-      </w:r>
-      <w:r>
-        <w:t>High-risk proposals requiring restructuring or pass.</w:t>
+        <w:t>In the global entertainment and film distribution industry, content acquisition executives spend millions acquiring theatrical and streaming distribution rights long before a film is completed or released to audiences. Traditionally, acquisition decisions have relied heavily on subjective script reviews and unquantified star reputation.</w:t>
       </w:r>
     </w:p>
     <w:p>
@@ -152,41 +238,118 @@
     </w:p>
     <w:p>
       <w:pPr>
-        <w:spacing w:before="360" w:after="160"/>
+        <w:spacing w:before="400" w:after="160"/>
       </w:pPr>
       <w:r>
         <w:rPr>
           <w:rFonts w:ascii="Arial" w:hAnsi="Arial"/>
           <w:b/>
           <w:color w:val="2563EB"/>
-          <w:sz w:val="36"/>
+          <w:sz w:val="34"/>
         </w:rPr>
-        <w:t>3. Proposed Solution &amp; Key Innovations</w:t>
+        <w:t>3. User Interaction &amp; Journey Flowchart</w:t>
       </w:r>
     </w:p>
     <w:p>
       <w:r>
-        <w:t>The proposed solution is a full-stack Machine Learning application featuring:</w:t>
+        <w:t>The user flow defines how acquisition executives, studio heads, and producers navigate the system from initial landing to final recommendation rendering:</w:t>
       </w:r>
     </w:p>
     <w:p>
+      <w:pPr>
+        <w:spacing w:before="160" w:after="240"/>
+      </w:pPr>
+    </w:p>
+    <w:tbl>
+      <w:tblPr>
+        <w:tblW w:type="auto" w:w="0"/>
+        <w:jc w:val="center"/>
+        <w:tblLook w:firstColumn="1" w:firstRow="1" w:lastColumn="0" w:lastRow="0" w:noHBand="0" w:noVBand="1" w:val="04A0"/>
+      </w:tblPr>
+      <w:tblGrid>
+        <w:gridCol w:w="9360"/>
+      </w:tblGrid>
+      <w:tr>
+        <w:tc>
+          <w:tcPr>
+            <w:tcW w:type="dxa" w:w="9360"/>
+            <w:shd w:fill="EFF6FF"/>
+          </w:tcPr>
+          <w:p>
+            <w:r>
+              <w:rPr>
+                <w:b/>
+                <w:color w:val="2563EB"/>
+                <w:sz w:val="22"/>
+              </w:rPr>
+              <w:t>📌 User Journey Flowchart</w:t>
+              <w:br/>
+            </w:r>
+            <w:r>
+              <w:rPr>
+                <w:color w:val="0F172A"/>
+                <w:sz w:val="20"/>
+              </w:rPr>
+              <w:t xml:space="preserve">[User Arrives at Platform] ➔ </w:t>
+            </w:r>
+            <w:r>
+              <w:rPr>
+                <w:color w:val="0F172A"/>
+                <w:sz w:val="20"/>
+              </w:rPr>
+              <w:t xml:space="preserve">[Select Page (Home / App / About)] ➔ </w:t>
+            </w:r>
+            <w:r>
+              <w:rPr>
+                <w:color w:val="0F172A"/>
+                <w:sz w:val="20"/>
+              </w:rPr>
+              <w:t xml:space="preserve">[Select Input Mode (Instant Preset vs Manual Input)] ➔ </w:t>
+            </w:r>
+            <w:r>
+              <w:rPr>
+                <w:color w:val="0F172A"/>
+                <w:sz w:val="20"/>
+              </w:rPr>
+              <w:t xml:space="preserve">[Form Pre-filled / Submitted] ➔ </w:t>
+            </w:r>
+            <w:r>
+              <w:rPr>
+                <w:color w:val="0F172A"/>
+                <w:sz w:val="20"/>
+              </w:rPr>
+              <w:t xml:space="preserve">[POST /api/predict Execution] ➔ </w:t>
+            </w:r>
+            <w:r>
+              <w:rPr>
+                <w:color w:val="0F172A"/>
+                <w:sz w:val="20"/>
+              </w:rPr>
+              <w:t xml:space="preserve">[Category Output (High / Medium / Low)] ➔ </w:t>
+            </w:r>
+            <w:r>
+              <w:rPr>
+                <w:color w:val="0F172A"/>
+                <w:sz w:val="20"/>
+              </w:rPr>
+              <w:t>[Doughnut Chart &amp; Strategic Acquisition Advice Rendered]</w:t>
+            </w:r>
+          </w:p>
+        </w:tc>
+      </w:tr>
+    </w:tbl>
+    <w:p>
+      <w:pPr>
+        <w:spacing w:before="400" w:after="160"/>
+      </w:pPr>
       <w:r>
-        <w:t>1. Pan-India Star Synergy Engine: Automated reputation indices (1.0 - 10.0) for Directors, Lead Actors, Actresses, Co-actors, and Music Composers.</w:t>
-      </w:r>
-    </w:p>
-    <w:p>
-      <w:r>
-        <w:t>2. 66-Dimensional Feature Vectorizer: Integrates 52+ journal content themes, budget currency scaling to USD (INR, USD, EUR, GBP), runtime classification, and popularity tags.</w:t>
-      </w:r>
-    </w:p>
-    <w:p>
-      <w:r>
-        <w:t>3. Zero-Data-Leakage ML Architecture: Stratified 80/20 train-test split executed before fitting imputers and scalers.</w:t>
-      </w:r>
-    </w:p>
-    <w:p>
-      <w:r>
-        <w:t>4. Executive Acquisition Strategy Matrix: Translates model probabilities directly into Greenlight Badges and Marketing Budget Allocations (25-35%).</w:t>
+        <w:rPr>
+          <w:rFonts w:ascii="Arial" w:hAnsi="Arial"/>
+          <w:b/>
+          <w:color w:val="2563EB"/>
+          <w:sz w:val="34"/>
+        </w:rPr>
+        <w:t>4. Proposed Solution &amp; Key Innovations</w:t>
       </w:r>
     </w:p>
     <w:p>
@@ -231,23 +394,177 @@
     </w:p>
     <w:p>
       <w:pPr>
-        <w:spacing w:before="360" w:after="160"/>
+        <w:pStyle w:val="ListBullet"/>
+        <w:spacing w:after="80"/>
+      </w:pPr>
+      <w:r>
+        <w:rPr>
+          <w:b/>
+          <w:color w:val="0F172A"/>
+        </w:rPr>
+        <w:t xml:space="preserve">1. Pan-India Star Synergy Engine: </w:t>
+      </w:r>
+      <w:r>
+        <w:rPr>
+          <w:color w:val="475569"/>
+        </w:rPr>
+        <w:t>Computes dynamic reputation indices (1.0 - 10.0) across Directors, Lead Actors, Actresses, Co-actors, and Music Composers.</w:t>
+      </w:r>
+    </w:p>
+    <w:p>
+      <w:pPr>
+        <w:pStyle w:val="ListBullet"/>
+        <w:spacing w:after="80"/>
+      </w:pPr>
+      <w:r>
+        <w:rPr>
+          <w:b/>
+          <w:color w:val="0F172A"/>
+        </w:rPr>
+        <w:t xml:space="preserve">2. Multi-Currency Global Budget Converter: </w:t>
+      </w:r>
+      <w:r>
+        <w:rPr>
+          <w:color w:val="475569"/>
+        </w:rPr>
+        <w:t>Supports budget inputs across 4 currencies (INR ₹, USD $, EUR €, GBP £) and 4 units (Crores, Lakhs, Millions, Thousands).</w:t>
+      </w:r>
+    </w:p>
+    <w:p>
+      <w:pPr>
+        <w:pStyle w:val="ListBullet"/>
+        <w:spacing w:after="80"/>
+      </w:pPr>
+      <w:r>
+        <w:rPr>
+          <w:b/>
+          <w:color w:val="0F172A"/>
+        </w:rPr>
+        <w:t xml:space="preserve">3. 52+ Journal Content Theme Vectorizer: </w:t>
+      </w:r>
+      <w:r>
+        <w:rPr>
+          <w:color w:val="475569"/>
+        </w:rPr>
+        <w:t>Vectorizes 52 multi-select journal content themes and popularity driver tags.</w:t>
+      </w:r>
+    </w:p>
+    <w:p>
+      <w:pPr>
+        <w:spacing w:before="400" w:after="160"/>
       </w:pPr>
       <w:r>
         <w:rPr>
           <w:rFonts w:ascii="Arial" w:hAnsi="Arial"/>
           <w:b/>
           <w:color w:val="2563EB"/>
-          <w:sz w:val="36"/>
+          <w:sz w:val="34"/>
         </w:rPr>
-        <w:t>4. Technical System Architecture</w:t>
+        <w:t>5. End-to-End Data Flowchart &amp; Pipeline Architecture</w:t>
       </w:r>
     </w:p>
     <w:p>
       <w:r>
-        <w:t>The application architecture consists of a 4-step workflow: Input Ingestion → 66D Feature Vectorizer → Scikit-Learn Preprocessing Pipeline → Gradient Boosting Inference Engine → Strategic Advice Matrix.</w:t>
+        <w:t>The data flow defines the movement and transformation of data from client form inputs to 66-dimensional feature vectors, preprocessing, ML inference, and strategic output:</w:t>
       </w:r>
     </w:p>
+    <w:p>
+      <w:pPr>
+        <w:spacing w:before="160" w:after="240"/>
+      </w:pPr>
+    </w:p>
+    <w:tbl>
+      <w:tblPr>
+        <w:tblW w:type="auto" w:w="0"/>
+        <w:jc w:val="center"/>
+        <w:tblLook w:firstColumn="1" w:firstRow="1" w:lastColumn="0" w:lastRow="0" w:noHBand="0" w:noVBand="1" w:val="04A0"/>
+      </w:tblPr>
+      <w:tblGrid>
+        <w:gridCol w:w="9360"/>
+      </w:tblGrid>
+      <w:tr>
+        <w:tc>
+          <w:tcPr>
+            <w:tcW w:type="dxa" w:w="9360"/>
+            <w:shd w:fill="EFF6FF"/>
+          </w:tcPr>
+          <w:p>
+            <w:r>
+              <w:rPr>
+                <w:b/>
+                <w:color w:val="2563EB"/>
+                <w:sz w:val="22"/>
+              </w:rPr>
+              <w:t>📌 Data Flowchart Architecture</w:t>
+              <w:br/>
+            </w:r>
+            <w:r>
+              <w:rPr>
+                <w:color w:val="0F172A"/>
+                <w:sz w:val="20"/>
+              </w:rPr>
+              <w:t xml:space="preserve">[Form Inputs JSON Payload] ➔ </w:t>
+            </w:r>
+            <w:r>
+              <w:rPr>
+                <w:color w:val="0F172A"/>
+                <w:sz w:val="20"/>
+              </w:rPr>
+              <w:t xml:space="preserve">[Star Synergy Index Lookup] ➔ </w:t>
+            </w:r>
+            <w:r>
+              <w:rPr>
+                <w:color w:val="0F172A"/>
+                <w:sz w:val="20"/>
+              </w:rPr>
+              <w:t xml:space="preserve">[Multi-Currency USD Scaling] ➔ </w:t>
+            </w:r>
+            <w:r>
+              <w:rPr>
+                <w:color w:val="0F172A"/>
+                <w:sz w:val="20"/>
+              </w:rPr>
+              <w:t xml:space="preserve">[52+ Theme Vectorizer] ➔ </w:t>
+            </w:r>
+            <w:r>
+              <w:rPr>
+                <w:color w:val="0F172A"/>
+                <w:sz w:val="20"/>
+              </w:rPr>
+              <w:t xml:space="preserve">[66D Feature Vector] ➔ </w:t>
+            </w:r>
+            <w:r>
+              <w:rPr>
+                <w:color w:val="0F172A"/>
+                <w:sz w:val="20"/>
+              </w:rPr>
+              <w:t xml:space="preserve">[Scikit-Learn Preprocessor] ➔ </w:t>
+            </w:r>
+            <w:r>
+              <w:rPr>
+                <w:color w:val="0F172A"/>
+                <w:sz w:val="20"/>
+              </w:rPr>
+              <w:t xml:space="preserve">[Gradient Boosting Inference] ➔ </w:t>
+            </w:r>
+            <w:r>
+              <w:rPr>
+                <w:color w:val="0F172A"/>
+                <w:sz w:val="20"/>
+              </w:rPr>
+              <w:t xml:space="preserve">[Category Probabilities] ➔ </w:t>
+            </w:r>
+            <w:r>
+              <w:rPr>
+                <w:color w:val="0F172A"/>
+                <w:sz w:val="20"/>
+              </w:rPr>
+              <w:t>[Strategic Advice Matrix Response]</w:t>
+            </w:r>
+          </w:p>
+        </w:tc>
+      </w:tr>
+    </w:tbl>
     <w:p>
       <w:pPr>
         <w:spacing w:before="200" w:after="280"/>
@@ -290,41 +607,125 @@
     </w:p>
     <w:p>
       <w:pPr>
-        <w:spacing w:before="360" w:after="160"/>
+        <w:spacing w:before="400" w:after="160"/>
       </w:pPr>
       <w:r>
         <w:rPr>
           <w:rFonts w:ascii="Arial" w:hAnsi="Arial"/>
           <w:b/>
           <w:color w:val="2563EB"/>
-          <w:sz w:val="36"/>
+          <w:sz w:val="34"/>
         </w:rPr>
-        <w:t>5. Technology Stack &amp; Frameworks</w:t>
+        <w:t>6. Machine Learning Model Training Workflow Flowchart</w:t>
       </w:r>
     </w:p>
     <w:p>
       <w:r>
-        <w:t>• Core Language: Python 3.14</w:t>
+        <w:t>The machine learning lifecycle flow ensures rigorous model benchmarking and zero data leakage:</w:t>
       </w:r>
     </w:p>
     <w:p>
+      <w:pPr>
+        <w:spacing w:before="160" w:after="240"/>
+      </w:pPr>
+    </w:p>
+    <w:tbl>
+      <w:tblPr>
+        <w:tblW w:type="auto" w:w="0"/>
+        <w:jc w:val="center"/>
+        <w:tblLook w:firstColumn="1" w:firstRow="1" w:lastColumn="0" w:lastRow="0" w:noHBand="0" w:noVBand="1" w:val="04A0"/>
+      </w:tblPr>
+      <w:tblGrid>
+        <w:gridCol w:w="9360"/>
+      </w:tblGrid>
+      <w:tr>
+        <w:tc>
+          <w:tcPr>
+            <w:tcW w:type="dxa" w:w="9360"/>
+            <w:shd w:fill="EFF6FF"/>
+          </w:tcPr>
+          <w:p>
+            <w:r>
+              <w:rPr>
+                <w:b/>
+                <w:color w:val="2563EB"/>
+                <w:sz w:val="22"/>
+              </w:rPr>
+              <w:t>📌 Machine Learning Workflow Flowchart</w:t>
+              <w:br/>
+            </w:r>
+            <w:r>
+              <w:rPr>
+                <w:color w:val="0F172A"/>
+                <w:sz w:val="20"/>
+              </w:rPr>
+              <w:t xml:space="preserve">[Data Ingestion (4,883 Records)] ➔ </w:t>
+            </w:r>
+            <w:r>
+              <w:rPr>
+                <w:color w:val="0F172A"/>
+                <w:sz w:val="20"/>
+              </w:rPr>
+              <w:t xml:space="preserve">[Data Cleaning &amp; Imputation] ➔ </w:t>
+            </w:r>
+            <w:r>
+              <w:rPr>
+                <w:color w:val="0F172A"/>
+                <w:sz w:val="20"/>
+              </w:rPr>
+              <w:t xml:space="preserve">[Domain Feature Engineering (66D)] ➔ </w:t>
+            </w:r>
+            <w:r>
+              <w:rPr>
+                <w:color w:val="0F172A"/>
+                <w:sz w:val="20"/>
+              </w:rPr>
+              <w:t xml:space="preserve">[Stratified 80/20 Train-Test Split] ➔ </w:t>
+            </w:r>
+            <w:r>
+              <w:rPr>
+                <w:color w:val="0F172A"/>
+                <w:sz w:val="20"/>
+              </w:rPr>
+              <w:t xml:space="preserve">[Fit Imputer + OneHot + Scaler on Train Set ONLY] ➔ </w:t>
+            </w:r>
+            <w:r>
+              <w:rPr>
+                <w:color w:val="0F172A"/>
+                <w:sz w:val="20"/>
+              </w:rPr>
+              <w:t xml:space="preserve">[Multi-Model Benchmarking (GB, RF, LR, XGB)] ➔ </w:t>
+            </w:r>
+            <w:r>
+              <w:rPr>
+                <w:color w:val="0F172A"/>
+                <w:sz w:val="20"/>
+              </w:rPr>
+              <w:t xml:space="preserve">[Metric Evaluation (Accuracy: 0.9980, F1: 0.9980)] ➔ </w:t>
+            </w:r>
+            <w:r>
+              <w:rPr>
+                <w:color w:val="0F172A"/>
+                <w:sz w:val="20"/>
+              </w:rPr>
+              <w:t>[Artifact Serialization (best_model.joblib)]</w:t>
+            </w:r>
+          </w:p>
+        </w:tc>
+      </w:tr>
+    </w:tbl>
+    <w:p>
+      <w:pPr>
+        <w:spacing w:before="400" w:after="160"/>
+      </w:pPr>
       <w:r>
-        <w:t>• Web Frameworks: Flask (app_flask.py) &amp; Streamlit (app.py / streamlit_app.py)</w:t>
-      </w:r>
-    </w:p>
-    <w:p>
-      <w:r>
-        <w:t>• Machine Learning &amp; Data: scikit-learn, xgboost, pandas, numpy, joblib</w:t>
-      </w:r>
-    </w:p>
-    <w:p>
-      <w:r>
-        <w:t>• Frontend Engine: HTML5, Executive White Glassmorphic CSS3, JavaScript (ES6+), Chart.js, AOS.js, GSAP, Canvas Confetti</w:t>
-      </w:r>
-    </w:p>
-    <w:p>
-      <w:r>
-        <w:t>• Version Control &amp; Cloud Deployment: Git, GitHub, Vercel, Streamlit Cloud</w:t>
+        <w:rPr>
+          <w:rFonts w:ascii="Arial" w:hAnsi="Arial"/>
+          <w:b/>
+          <w:color w:val="2563EB"/>
+          <w:sz w:val="34"/>
+        </w:rPr>
+        <w:t>7. Technology Stack &amp; Frameworks</w:t>
       </w:r>
     </w:p>
     <w:p>
@@ -369,28 +770,22 @@
     </w:p>
     <w:p>
       <w:pPr>
-        <w:spacing w:before="360" w:after="160"/>
+        <w:spacing w:before="400" w:after="160"/>
       </w:pPr>
       <w:r>
         <w:rPr>
           <w:rFonts w:ascii="Arial" w:hAnsi="Arial"/>
           <w:b/>
           <w:color w:val="2563EB"/>
-          <w:sz w:val="36"/>
+          <w:sz w:val="34"/>
         </w:rPr>
-        <w:t>6. Model Evaluation Benchmarks &amp; Metrics</w:t>
-      </w:r>
-    </w:p>
-    <w:p>
-      <w:r>
-        <w:t>Quantitative evaluation results conducted on a stratified 20% holdout test partition (977 unseen film records):</w:t>
+        <w:t>8. Model Evaluation Benchmarks &amp; Metrics</w:t>
       </w:r>
     </w:p>
     <w:tbl>
       <w:tblPr>
         <w:tblW w:type="auto" w:w="0"/>
         <w:jc w:val="center"/>
-        <w:tblLayout w:type="fixed"/>
         <w:tblLook w:firstColumn="1" w:firstRow="1" w:lastColumn="0" w:lastRow="0" w:noHBand="0" w:noVBand="1" w:val="04A0"/>
       </w:tblPr>
       <w:tblGrid>
@@ -864,52 +1259,240 @@
     </w:tbl>
     <w:p>
       <w:pPr>
-        <w:spacing w:after="240"/>
+        <w:spacing w:after="280"/>
       </w:pPr>
     </w:p>
     <w:p>
       <w:pPr>
-        <w:spacing w:before="360" w:after="160"/>
+        <w:spacing w:before="400" w:after="160"/>
       </w:pPr>
       <w:r>
         <w:rPr>
           <w:rFonts w:ascii="Arial" w:hAnsi="Arial"/>
           <w:b/>
           <w:color w:val="2563EB"/>
-          <w:sz w:val="36"/>
+          <w:sz w:val="34"/>
         </w:rPr>
-        <w:t>7. Feature Importance Drivers</w:t>
+        <w:t>9. Commercial Acquisition Strategy Matrix</w:t>
       </w:r>
     </w:p>
+    <w:tbl>
+      <w:tblPr>
+        <w:tblW w:type="auto" w:w="0"/>
+        <w:jc w:val="center"/>
+        <w:tblLook w:firstColumn="1" w:firstRow="1" w:lastColumn="0" w:lastRow="0" w:noHBand="0" w:noVBand="1" w:val="04A0"/>
+      </w:tblPr>
+      <w:tblGrid>
+        <w:gridCol w:w="2340"/>
+        <w:gridCol w:w="2340"/>
+        <w:gridCol w:w="2340"/>
+        <w:gridCol w:w="2340"/>
+      </w:tblGrid>
+      <w:tr>
+        <w:tc>
+          <w:tcPr>
+            <w:tcW w:type="dxa" w:w="2340"/>
+            <w:shd w:fill="2563EB"/>
+          </w:tcPr>
+          <w:p>
+            <w:r>
+              <w:rPr>
+                <w:b/>
+                <w:color w:val="FFFFFF"/>
+              </w:rPr>
+              <w:t>Predicted Category</w:t>
+            </w:r>
+          </w:p>
+        </w:tc>
+        <w:tc>
+          <w:tcPr>
+            <w:tcW w:type="dxa" w:w="2340"/>
+            <w:shd w:fill="2563EB"/>
+          </w:tcPr>
+          <w:p>
+            <w:r>
+              <w:rPr>
+                <w:b/>
+                <w:color w:val="FFFFFF"/>
+              </w:rPr>
+              <w:t>Action Badge</w:t>
+            </w:r>
+          </w:p>
+        </w:tc>
+        <w:tc>
+          <w:tcPr>
+            <w:tcW w:type="dxa" w:w="2340"/>
+            <w:shd w:fill="2563EB"/>
+          </w:tcPr>
+          <w:p>
+            <w:r>
+              <w:rPr>
+                <w:b/>
+                <w:color w:val="FFFFFF"/>
+              </w:rPr>
+              <w:t>Marketing Spend %</w:t>
+            </w:r>
+          </w:p>
+        </w:tc>
+        <w:tc>
+          <w:tcPr>
+            <w:tcW w:type="dxa" w:w="2340"/>
+            <w:shd w:fill="2563EB"/>
+          </w:tcPr>
+          <w:p>
+            <w:r>
+              <w:rPr>
+                <w:b/>
+                <w:color w:val="FFFFFF"/>
+              </w:rPr>
+              <w:t>Platform Placement</w:t>
+            </w:r>
+          </w:p>
+        </w:tc>
+      </w:tr>
+      <w:tr>
+        <w:tc>
+          <w:tcPr>
+            <w:tcW w:type="dxa" w:w="2340"/>
+            <w:shd w:fill="F0FDF4"/>
+          </w:tcPr>
+          <w:p>
+            <w:r>
+              <w:t>High Quality (≥ 7.5)</w:t>
+            </w:r>
+          </w:p>
+        </w:tc>
+        <w:tc>
+          <w:tcPr>
+            <w:tcW w:type="dxa" w:w="2340"/>
+            <w:shd w:fill="F0FDF4"/>
+          </w:tcPr>
+          <w:p>
+            <w:r>
+              <w:t>Greenlight / Instant Acquisition</w:t>
+            </w:r>
+          </w:p>
+        </w:tc>
+        <w:tc>
+          <w:tcPr>
+            <w:tcW w:type="dxa" w:w="2340"/>
+            <w:shd w:fill="F0FDF4"/>
+          </w:tcPr>
+          <w:p>
+            <w:r>
+              <w:t>25% - 35% of Budget</w:t>
+            </w:r>
+          </w:p>
+        </w:tc>
+        <w:tc>
+          <w:tcPr>
+            <w:tcW w:type="dxa" w:w="2340"/>
+            <w:shd w:fill="F0FDF4"/>
+          </w:tcPr>
+          <w:p>
+            <w:r>
+              <w:t>Prime-Time Digital Premiere &amp; Global Theatrical</w:t>
+            </w:r>
+          </w:p>
+        </w:tc>
+      </w:tr>
+      <w:tr>
+        <w:tc>
+          <w:tcPr>
+            <w:tcW w:type="dxa" w:w="2340"/>
+            <w:shd w:fill="FFFBEB"/>
+          </w:tcPr>
+          <w:p>
+            <w:r>
+              <w:t>Medium Quality (5.5 - 7.4)</w:t>
+            </w:r>
+          </w:p>
+        </w:tc>
+        <w:tc>
+          <w:tcPr>
+            <w:tcW w:type="dxa" w:w="2340"/>
+            <w:shd w:fill="FFFBEB"/>
+          </w:tcPr>
+          <w:p>
+            <w:r>
+              <w:t>Conditional Acquisition</w:t>
+            </w:r>
+          </w:p>
+        </w:tc>
+        <w:tc>
+          <w:tcPr>
+            <w:tcW w:type="dxa" w:w="2340"/>
+            <w:shd w:fill="FFFBEB"/>
+          </w:tcPr>
+          <w:p>
+            <w:r>
+              <w:t>10% - 20% of Budget</w:t>
+            </w:r>
+          </w:p>
+        </w:tc>
+        <w:tc>
+          <w:tcPr>
+            <w:tcW w:type="dxa" w:w="2340"/>
+            <w:shd w:fill="FFFBEB"/>
+          </w:tcPr>
+          <w:p>
+            <w:r>
+              <w:t>SVOD Standard Catalog &amp; Regional Theatrical</w:t>
+            </w:r>
+          </w:p>
+        </w:tc>
+      </w:tr>
+      <w:tr>
+        <w:tc>
+          <w:tcPr>
+            <w:tcW w:type="dxa" w:w="2340"/>
+            <w:shd w:fill="FEF2F2"/>
+          </w:tcPr>
+          <w:p>
+            <w:r>
+              <w:t>Low Quality (&lt; 5.5)</w:t>
+            </w:r>
+          </w:p>
+        </w:tc>
+        <w:tc>
+          <w:tcPr>
+            <w:tcW w:type="dxa" w:w="2340"/>
+            <w:shd w:fill="FEF2F2"/>
+          </w:tcPr>
+          <w:p>
+            <w:r>
+              <w:t>Pass / High Risk Acquisition</w:t>
+            </w:r>
+          </w:p>
+        </w:tc>
+        <w:tc>
+          <w:tcPr>
+            <w:tcW w:type="dxa" w:w="2340"/>
+            <w:shd w:fill="FEF2F2"/>
+          </w:tcPr>
+          <w:p>
+            <w:r>
+              <w:t>Minimal (&lt; 5%)</w:t>
+            </w:r>
+          </w:p>
+        </w:tc>
+        <w:tc>
+          <w:tcPr>
+            <w:tcW w:type="dxa" w:w="2340"/>
+            <w:shd w:fill="FEF2F2"/>
+          </w:tcPr>
+          <w:p>
+            <w:r>
+              <w:t>Ad-Supported AVOD / Licensing Fee Discount</w:t>
+            </w:r>
+          </w:p>
+        </w:tc>
+      </w:tr>
+    </w:tbl>
     <w:p>
-      <w:r>
-        <w:t>Top predictive drivers influencing film rating categories:</w:t>
-      </w:r>
-    </w:p>
-    <w:p>
-      <w:r>
-        <w:t>1. Director Reputation Score (28.4% Importance)</w:t>
-      </w:r>
-    </w:p>
-    <w:p>
-      <w:r>
-        <w:t>2. Director &amp; Cast Synergy Product (22.1% Importance)</w:t>
-      </w:r>
-    </w:p>
-    <w:p>
-      <w:r>
-        <w:t>3. Scaled Production Budget in USD (16.8% Importance)</w:t>
-      </w:r>
-    </w:p>
-    <w:p>
-      <w:r>
-        <w:t>4. Lead Actor &amp; Actress Star Power (12.5% Importance)</w:t>
-      </w:r>
-    </w:p>
-    <w:p>
-      <w:r>
-        <w:t>5. Marketing-to-Production Budget Ratio (8.2% Importance)</w:t>
-      </w:r>
+      <w:pPr>
+        <w:spacing w:after="280"/>
+      </w:pPr>
     </w:p>
     <w:sectPr>
       <w:pgSz w:w="12240" w:h="15840"/>

</xml_diff>